<commit_message>
Polish proposal: fixed table widths, en-GB proofing, assumptions block, tidy cover fee card
Co-authored-by: arena-agent <297053741+arena-agent@users.noreply.github.com>
</commit_message>
<xml_diff>
--- a/BAAY_PROJECTS_LIMITED_Engagement_Proposal_Zoho_Books_and_Tax.docx
+++ b/BAAY_PROJECTS_LIMITED_Engagement_Proposal_Zoho_Books_and_Tax.docx
@@ -128,7 +128,7 @@
     </w:p>
     <w:tbl>
       <w:tblPr>
-        <w:tblW w:type="auto" w:w="0"/>
+        <w:tblW w:w="9297" w:type="dxa"/>
         <w:jc w:val="center"/>
         <w:tblBorders>
           <w:top w:val="nil"/>
@@ -138,7 +138,6 @@
           <w:insideH w:val="nil"/>
           <w:insideV w:val="nil"/>
         </w:tblBorders>
-        <w:tblLayout w:type="fixed"/>
         <w:tblLayout w:type="fixed"/>
         <w:tblLook w:firstColumn="1" w:firstRow="1" w:lastColumn="0" w:lastRow="0" w:noHBand="0" w:noVBand="1" w:val="04A0"/>
       </w:tblPr>
@@ -245,7 +244,7 @@
                 <w:color w:val="FFFFFF"/>
                 <w:sz w:val="34"/>
               </w:rPr>
-              <w:t>Monthly</w:t>
+              <w:t>From ₦250k</w:t>
             </w:r>
           </w:p>
           <w:p>
@@ -260,7 +259,7 @@
                 <w:color w:val="D8E0DA"/>
                 <w:sz w:val="14"/>
               </w:rPr>
-              <w:t>VAT, WHT, PAYE, CIT, TET</w:t>
+              <w:t>per month, VAT-exclusive</w:t>
             </w:r>
           </w:p>
         </w:tc>
@@ -468,7 +467,7 @@
     </w:p>
     <w:tbl>
       <w:tblPr>
-        <w:tblW w:type="auto" w:w="0"/>
+        <w:tblW w:w="9298" w:type="dxa"/>
         <w:jc w:val="center"/>
         <w:tblBorders>
           <w:top w:val="nil"/>
@@ -478,7 +477,6 @@
           <w:insideH w:val="nil"/>
           <w:insideV w:val="nil"/>
         </w:tblBorders>
-        <w:tblLayout w:type="fixed"/>
         <w:tblLayout w:type="fixed"/>
         <w:tblLook w:firstColumn="1" w:firstRow="1" w:lastColumn="0" w:lastRow="0" w:noHBand="0" w:noVBand="1" w:val="04A0"/>
       </w:tblPr>
@@ -789,7 +787,7 @@
     </w:p>
     <w:tbl>
       <w:tblPr>
-        <w:tblW w:type="auto" w:w="0"/>
+        <w:tblW w:w="9297" w:type="dxa"/>
         <w:jc w:val="center"/>
         <w:tblBorders>
           <w:top w:val="nil"/>
@@ -799,7 +797,6 @@
           <w:insideH w:val="nil"/>
           <w:insideV w:val="nil"/>
         </w:tblBorders>
-        <w:tblLayout w:type="fixed"/>
         <w:tblLayout w:type="fixed"/>
         <w:tblLook w:firstColumn="1" w:firstRow="1" w:lastColumn="0" w:lastRow="0" w:noHBand="0" w:noVBand="1" w:val="04A0"/>
       </w:tblPr>
@@ -1032,7 +1029,7 @@
     </w:p>
     <w:tbl>
       <w:tblPr>
-        <w:tblW w:type="auto" w:w="0"/>
+        <w:tblW w:w="9297" w:type="dxa"/>
         <w:jc w:val="center"/>
         <w:tblBorders>
           <w:top w:val="nil"/>
@@ -1042,7 +1039,6 @@
           <w:insideH w:val="nil"/>
           <w:insideV w:val="nil"/>
         </w:tblBorders>
-        <w:tblLayout w:type="fixed"/>
         <w:tblLayout w:type="fixed"/>
         <w:tblLook w:firstColumn="1" w:firstRow="1" w:lastColumn="0" w:lastRow="0" w:noHBand="0" w:noVBand="1" w:val="04A0"/>
       </w:tblPr>
@@ -1411,7 +1407,7 @@
     </w:p>
     <w:tbl>
       <w:tblPr>
-        <w:tblW w:type="auto" w:w="0"/>
+        <w:tblW w:w="9298" w:type="dxa"/>
         <w:jc w:val="center"/>
         <w:tblBorders>
           <w:top w:val="nil"/>
@@ -1421,7 +1417,6 @@
           <w:insideH w:val="nil"/>
           <w:insideV w:val="nil"/>
         </w:tblBorders>
-        <w:tblLayout w:type="fixed"/>
         <w:tblLayout w:type="fixed"/>
         <w:tblLook w:firstColumn="1" w:firstRow="1" w:lastColumn="0" w:lastRow="0" w:noHBand="0" w:noVBand="1" w:val="04A0"/>
       </w:tblPr>
@@ -1500,7 +1495,7 @@
     </w:p>
     <w:tbl>
       <w:tblPr>
-        <w:tblW w:type="auto" w:w="0"/>
+        <w:tblW w:w="9298" w:type="dxa"/>
         <w:jc w:val="center"/>
         <w:tblBorders>
           <w:top w:val="nil"/>
@@ -1510,7 +1505,6 @@
           <w:insideH w:val="nil"/>
           <w:insideV w:val="nil"/>
         </w:tblBorders>
-        <w:tblLayout w:type="fixed"/>
         <w:tblLayout w:type="fixed"/>
         <w:tblLook w:firstColumn="1" w:firstRow="1" w:lastColumn="0" w:lastRow="0" w:noHBand="0" w:noVBand="1" w:val="04A0"/>
       </w:tblPr>
@@ -1624,7 +1618,7 @@
     </w:p>
     <w:tbl>
       <w:tblPr>
-        <w:tblW w:type="auto" w:w="0"/>
+        <w:tblW w:w="9298" w:type="dxa"/>
         <w:jc w:val="center"/>
         <w:tblBorders>
           <w:top w:val="single" w:sz="4" w:space="0" w:color="D9D3C6"/>
@@ -1634,7 +1628,6 @@
           <w:insideH w:val="single" w:sz="4" w:space="0" w:color="D9D3C6"/>
           <w:insideV w:val="single" w:sz="4" w:space="0" w:color="D9D3C6"/>
         </w:tblBorders>
-        <w:tblLayout w:type="fixed"/>
         <w:tblLayout w:type="fixed"/>
         <w:tblLook w:firstColumn="1" w:firstRow="1" w:lastColumn="0" w:lastRow="0" w:noHBand="0" w:noVBand="1" w:val="04A0"/>
       </w:tblPr>
@@ -2217,7 +2210,7 @@
     </w:p>
     <w:tbl>
       <w:tblPr>
-        <w:tblW w:type="auto" w:w="0"/>
+        <w:tblW w:w="9298" w:type="dxa"/>
         <w:jc w:val="center"/>
         <w:tblBorders>
           <w:top w:val="single" w:sz="4" w:space="0" w:color="D9D3C6"/>
@@ -2227,7 +2220,6 @@
           <w:insideH w:val="single" w:sz="4" w:space="0" w:color="D9D3C6"/>
           <w:insideV w:val="single" w:sz="4" w:space="0" w:color="D9D3C6"/>
         </w:tblBorders>
-        <w:tblLayout w:type="fixed"/>
         <w:tblLayout w:type="fixed"/>
         <w:tblLook w:firstColumn="1" w:firstRow="1" w:lastColumn="0" w:lastRow="0" w:noHBand="0" w:noVBand="1" w:val="04A0"/>
       </w:tblPr>
@@ -3064,7 +3056,7 @@
     </w:p>
     <w:tbl>
       <w:tblPr>
-        <w:tblW w:type="auto" w:w="0"/>
+        <w:tblW w:w="9298" w:type="dxa"/>
         <w:jc w:val="center"/>
         <w:tblBorders>
           <w:top w:val="nil"/>
@@ -3074,7 +3066,6 @@
           <w:insideH w:val="nil"/>
           <w:insideV w:val="nil"/>
         </w:tblBorders>
-        <w:tblLayout w:type="fixed"/>
         <w:tblLayout w:type="fixed"/>
         <w:tblLook w:firstColumn="1" w:firstRow="1" w:lastColumn="0" w:lastRow="0" w:noHBand="0" w:noVBand="1" w:val="04A0"/>
       </w:tblPr>
@@ -3199,7 +3190,7 @@
     </w:p>
     <w:tbl>
       <w:tblPr>
-        <w:tblW w:type="auto" w:w="0"/>
+        <w:tblW w:w="9298" w:type="dxa"/>
         <w:jc w:val="center"/>
         <w:tblBorders>
           <w:top w:val="single" w:sz="4" w:space="0" w:color="D9D3C6"/>
@@ -3209,7 +3200,6 @@
           <w:insideH w:val="single" w:sz="4" w:space="0" w:color="D9D3C6"/>
           <w:insideV w:val="single" w:sz="4" w:space="0" w:color="D9D3C6"/>
         </w:tblBorders>
-        <w:tblLayout w:type="fixed"/>
         <w:tblLayout w:type="fixed"/>
         <w:tblLook w:firstColumn="1" w:firstRow="1" w:lastColumn="0" w:lastRow="0" w:noHBand="0" w:noVBand="1" w:val="04A0"/>
       </w:tblPr>
@@ -3965,7 +3955,7 @@
     </w:p>
     <w:tbl>
       <w:tblPr>
-        <w:tblW w:type="auto" w:w="0"/>
+        <w:tblW w:w="9298" w:type="dxa"/>
         <w:jc w:val="center"/>
         <w:tblBorders>
           <w:top w:val="nil"/>
@@ -3975,7 +3965,6 @@
           <w:insideH w:val="nil"/>
           <w:insideV w:val="nil"/>
         </w:tblBorders>
-        <w:tblLayout w:type="fixed"/>
         <w:tblLayout w:type="fixed"/>
         <w:tblLook w:firstColumn="1" w:firstRow="1" w:lastColumn="0" w:lastRow="0" w:noHBand="0" w:noVBand="1" w:val="04A0"/>
       </w:tblPr>
@@ -4049,7 +4038,7 @@
     </w:p>
     <w:tbl>
       <w:tblPr>
-        <w:tblW w:type="auto" w:w="0"/>
+        <w:tblW w:w="9298" w:type="dxa"/>
         <w:jc w:val="center"/>
         <w:tblBorders>
           <w:top w:val="nil"/>
@@ -4059,7 +4048,6 @@
           <w:insideH w:val="nil"/>
           <w:insideV w:val="nil"/>
         </w:tblBorders>
-        <w:tblLayout w:type="fixed"/>
         <w:tblLayout w:type="fixed"/>
         <w:tblLook w:firstColumn="1" w:firstRow="1" w:lastColumn="0" w:lastRow="0" w:noHBand="0" w:noVBand="1" w:val="04A0"/>
       </w:tblPr>
@@ -4138,7 +4126,7 @@
     </w:p>
     <w:tbl>
       <w:tblPr>
-        <w:tblW w:type="auto" w:w="0"/>
+        <w:tblW w:w="9298" w:type="dxa"/>
         <w:jc w:val="center"/>
         <w:tblBorders>
           <w:top w:val="nil"/>
@@ -4148,7 +4136,6 @@
           <w:insideH w:val="nil"/>
           <w:insideV w:val="nil"/>
         </w:tblBorders>
-        <w:tblLayout w:type="fixed"/>
         <w:tblLayout w:type="fixed"/>
         <w:tblLook w:firstColumn="1" w:firstRow="1" w:lastColumn="0" w:lastRow="0" w:noHBand="0" w:noVBand="1" w:val="04A0"/>
       </w:tblPr>
@@ -4262,7 +4249,7 @@
     </w:p>
     <w:tbl>
       <w:tblPr>
-        <w:tblW w:type="auto" w:w="0"/>
+        <w:tblW w:w="9298" w:type="dxa"/>
         <w:jc w:val="center"/>
         <w:tblBorders>
           <w:top w:val="single" w:sz="4" w:space="0" w:color="D9D3C6"/>
@@ -4272,7 +4259,6 @@
           <w:insideH w:val="single" w:sz="4" w:space="0" w:color="D9D3C6"/>
           <w:insideV w:val="single" w:sz="4" w:space="0" w:color="D9D3C6"/>
         </w:tblBorders>
-        <w:tblLayout w:type="fixed"/>
         <w:tblLayout w:type="fixed"/>
         <w:tblLook w:firstColumn="1" w:firstRow="1" w:lastColumn="0" w:lastRow="0" w:noHBand="0" w:noVBand="1" w:val="04A0"/>
       </w:tblPr>
@@ -5333,7 +5319,7 @@
     </w:p>
     <w:tbl>
       <w:tblPr>
-        <w:tblW w:type="auto" w:w="0"/>
+        <w:tblW w:w="9298" w:type="dxa"/>
         <w:jc w:val="center"/>
         <w:tblBorders>
           <w:top w:val="nil"/>
@@ -5343,7 +5329,6 @@
           <w:insideH w:val="nil"/>
           <w:insideV w:val="nil"/>
         </w:tblBorders>
-        <w:tblLayout w:type="fixed"/>
         <w:tblLayout w:type="fixed"/>
         <w:tblLook w:firstColumn="1" w:firstRow="1" w:lastColumn="0" w:lastRow="0" w:noHBand="0" w:noVBand="1" w:val="04A0"/>
       </w:tblPr>
@@ -5468,7 +5453,7 @@
     </w:p>
     <w:tbl>
       <w:tblPr>
-        <w:tblW w:type="auto" w:w="0"/>
+        <w:tblW w:w="9297" w:type="dxa"/>
         <w:jc w:val="center"/>
         <w:tblBorders>
           <w:top w:val="single" w:sz="4" w:space="0" w:color="D9D3C6"/>
@@ -5478,7 +5463,6 @@
           <w:insideH w:val="single" w:sz="4" w:space="0" w:color="D9D3C6"/>
           <w:insideV w:val="single" w:sz="4" w:space="0" w:color="D9D3C6"/>
         </w:tblBorders>
-        <w:tblLayout w:type="fixed"/>
         <w:tblLayout w:type="fixed"/>
         <w:tblLook w:firstColumn="1" w:firstRow="1" w:lastColumn="0" w:lastRow="0" w:noHBand="0" w:noVBand="1" w:val="04A0"/>
       </w:tblPr>
@@ -5780,7 +5764,7 @@
     </w:p>
     <w:tbl>
       <w:tblPr>
-        <w:tblW w:type="auto" w:w="0"/>
+        <w:tblW w:w="9298" w:type="dxa"/>
         <w:jc w:val="center"/>
         <w:tblBorders>
           <w:top w:val="single" w:sz="4" w:space="0" w:color="D9D3C6"/>
@@ -5790,7 +5774,6 @@
           <w:insideH w:val="single" w:sz="4" w:space="0" w:color="D9D3C6"/>
           <w:insideV w:val="single" w:sz="4" w:space="0" w:color="D9D3C6"/>
         </w:tblBorders>
-        <w:tblLayout w:type="fixed"/>
         <w:tblLayout w:type="fixed"/>
         <w:tblLook w:firstColumn="1" w:firstRow="1" w:lastColumn="0" w:lastRow="0" w:noHBand="0" w:noVBand="1" w:val="04A0"/>
       </w:tblPr>
@@ -6851,7 +6834,7 @@
     </w:p>
     <w:tbl>
       <w:tblPr>
-        <w:tblW w:type="auto" w:w="0"/>
+        <w:tblW w:w="9298" w:type="dxa"/>
         <w:jc w:val="center"/>
         <w:tblBorders>
           <w:top w:val="nil"/>
@@ -6861,7 +6844,6 @@
           <w:insideH w:val="nil"/>
           <w:insideV w:val="nil"/>
         </w:tblBorders>
-        <w:tblLayout w:type="fixed"/>
         <w:tblLayout w:type="fixed"/>
         <w:tblLook w:firstColumn="1" w:firstRow="1" w:lastColumn="0" w:lastRow="0" w:noHBand="0" w:noVBand="1" w:val="04A0"/>
       </w:tblPr>
@@ -7018,7 +7000,7 @@
     </w:p>
     <w:tbl>
       <w:tblPr>
-        <w:tblW w:type="auto" w:w="0"/>
+        <w:tblW w:w="9297" w:type="dxa"/>
         <w:jc w:val="center"/>
         <w:tblBorders>
           <w:top w:val="single" w:sz="4" w:space="0" w:color="D9D3C6"/>
@@ -7028,7 +7010,6 @@
           <w:insideH w:val="single" w:sz="4" w:space="0" w:color="D9D3C6"/>
           <w:insideV w:val="single" w:sz="4" w:space="0" w:color="D9D3C6"/>
         </w:tblBorders>
-        <w:tblLayout w:type="fixed"/>
         <w:tblLayout w:type="fixed"/>
         <w:tblLook w:firstColumn="1" w:firstRow="1" w:lastColumn="0" w:lastRow="0" w:noHBand="0" w:noVBand="1" w:val="04A0"/>
       </w:tblPr>
@@ -7770,7 +7751,7 @@
     </w:p>
     <w:tbl>
       <w:tblPr>
-        <w:tblW w:type="auto" w:w="0"/>
+        <w:tblW w:w="9298" w:type="dxa"/>
         <w:jc w:val="center"/>
         <w:tblBorders>
           <w:top w:val="nil"/>
@@ -7780,7 +7761,6 @@
           <w:insideH w:val="nil"/>
           <w:insideV w:val="nil"/>
         </w:tblBorders>
-        <w:tblLayout w:type="fixed"/>
         <w:tblLayout w:type="fixed"/>
         <w:tblLook w:firstColumn="1" w:firstRow="1" w:lastColumn="0" w:lastRow="0" w:noHBand="0" w:noVBand="1" w:val="04A0"/>
       </w:tblPr>
@@ -7890,7 +7870,7 @@
     </w:p>
     <w:tbl>
       <w:tblPr>
-        <w:tblW w:type="auto" w:w="0"/>
+        <w:tblW w:w="9298" w:type="dxa"/>
         <w:jc w:val="center"/>
         <w:tblBorders>
           <w:top w:val="single" w:sz="4" w:space="0" w:color="D9D3C6"/>
@@ -7900,7 +7880,6 @@
           <w:insideH w:val="single" w:sz="4" w:space="0" w:color="D9D3C6"/>
           <w:insideV w:val="single" w:sz="4" w:space="0" w:color="D9D3C6"/>
         </w:tblBorders>
-        <w:tblLayout w:type="fixed"/>
         <w:tblLayout w:type="fixed"/>
         <w:tblLook w:firstColumn="1" w:firstRow="1" w:lastColumn="0" w:lastRow="0" w:noHBand="0" w:noVBand="1" w:val="04A0"/>
       </w:tblPr>
@@ -8738,7 +8717,196 @@
     <w:p>
       <w:pPr>
         <w:keepNext/>
-        <w:spacing w:before="40" w:after="60"/>
+        <w:spacing w:before="0" w:after="60"/>
+      </w:pPr>
+      <w:r>
+        <w:rPr>
+          <w:rFonts w:ascii="Calibri" w:hAnsi="Calibri"/>
+          <w:b/>
+          <w:i w:val="0"/>
+          <w:color w:val="1B3A2F"/>
+          <w:sz w:val="21"/>
+        </w:rPr>
+        <w:t>Assumptions behind the fees</w:t>
+      </w:r>
+    </w:p>
+    <w:p>
+      <w:pPr>
+        <w:tabs>
+          <w:tab w:pos="312" w:val="left"/>
+        </w:tabs>
+        <w:spacing w:before="0" w:after="60" w:line="293" w:lineRule="auto"/>
+        <w:ind w:left="312" w:hanging="193"/>
+      </w:pPr>
+      <w:r>
+        <w:rPr>
+          <w:rFonts w:ascii="Calibri" w:hAnsi="Calibri"/>
+          <w:b/>
+          <w:i w:val="0"/>
+          <w:color w:val="B08A3E"/>
+          <w:sz w:val="21"/>
+        </w:rPr>
+        <w:t>•</w:t>
+        <w:tab/>
+      </w:r>
+      <w:r>
+        <w:rPr>
+          <w:rFonts w:ascii="Calibri" w:hAnsi="Calibri"/>
+          <w:b/>
+          <w:i w:val="0"/>
+          <w:color w:val="1B3A2F"/>
+          <w:sz w:val="21"/>
+        </w:rPr>
+        <w:t xml:space="preserve">Timeline: </w:t>
+      </w:r>
+      <w:r>
+        <w:rPr>
+          <w:rFonts w:ascii="Calibri" w:hAnsi="Calibri"/>
+          <w:b w:val="0"/>
+          <w:i w:val="0"/>
+          <w:color w:val="5C5C5C"/>
+          <w:sz w:val="21"/>
+        </w:rPr>
+        <w:t>eight weeks assumes access to the four bank accounts and the client register within five working days of kick-off.</w:t>
+      </w:r>
+    </w:p>
+    <w:p>
+      <w:pPr>
+        <w:tabs>
+          <w:tab w:pos="312" w:val="left"/>
+        </w:tabs>
+        <w:spacing w:before="0" w:after="60" w:line="293" w:lineRule="auto"/>
+        <w:ind w:left="312" w:hanging="193"/>
+      </w:pPr>
+      <w:r>
+        <w:rPr>
+          <w:rFonts w:ascii="Calibri" w:hAnsi="Calibri"/>
+          <w:b/>
+          <w:i w:val="0"/>
+          <w:color w:val="B08A3E"/>
+          <w:sz w:val="21"/>
+        </w:rPr>
+        <w:t>•</w:t>
+        <w:tab/>
+      </w:r>
+      <w:r>
+        <w:rPr>
+          <w:rFonts w:ascii="Calibri" w:hAnsi="Calibri"/>
+          <w:b/>
+          <w:i w:val="0"/>
+          <w:color w:val="1B3A2F"/>
+          <w:sz w:val="21"/>
+        </w:rPr>
+        <w:t xml:space="preserve">Scope: </w:t>
+      </w:r>
+      <w:r>
+        <w:rPr>
+          <w:rFonts w:ascii="Calibri" w:hAnsi="Calibri"/>
+          <w:b w:val="0"/>
+          <w:i w:val="0"/>
+          <w:color w:val="5C5C5C"/>
+          <w:sz w:val="21"/>
+        </w:rPr>
+        <w:t>one company, one currency, nine estates. A second entity or a new estate is scoped separately.</w:t>
+      </w:r>
+    </w:p>
+    <w:p>
+      <w:pPr>
+        <w:tabs>
+          <w:tab w:pos="312" w:val="left"/>
+        </w:tabs>
+        <w:spacing w:before="0" w:after="60" w:line="293" w:lineRule="auto"/>
+        <w:ind w:left="312" w:hanging="193"/>
+      </w:pPr>
+      <w:r>
+        <w:rPr>
+          <w:rFonts w:ascii="Calibri" w:hAnsi="Calibri"/>
+          <w:b/>
+          <w:i w:val="0"/>
+          <w:color w:val="B08A3E"/>
+          <w:sz w:val="21"/>
+        </w:rPr>
+        <w:t>•</w:t>
+        <w:tab/>
+      </w:r>
+      <w:r>
+        <w:rPr>
+          <w:rFonts w:ascii="Calibri" w:hAnsi="Calibri"/>
+          <w:b/>
+          <w:i w:val="0"/>
+          <w:color w:val="1B3A2F"/>
+          <w:sz w:val="21"/>
+        </w:rPr>
+        <w:t xml:space="preserve">Platform: </w:t>
+      </w:r>
+      <w:r>
+        <w:rPr>
+          <w:rFonts w:ascii="Calibri" w:hAnsi="Calibri"/>
+          <w:b w:val="0"/>
+          <w:i w:val="0"/>
+          <w:color w:val="5C5C5C"/>
+          <w:sz w:val="21"/>
+        </w:rPr>
+        <w:t>Zoho Books Nigeria edition, subscription paid by Baay directly to Zoho.</w:t>
+      </w:r>
+    </w:p>
+    <w:p>
+      <w:pPr>
+        <w:tabs>
+          <w:tab w:pos="312" w:val="left"/>
+        </w:tabs>
+        <w:spacing w:before="0" w:after="60" w:line="293" w:lineRule="auto"/>
+        <w:ind w:left="312" w:hanging="193"/>
+      </w:pPr>
+      <w:r>
+        <w:rPr>
+          <w:rFonts w:ascii="Calibri" w:hAnsi="Calibri"/>
+          <w:b/>
+          <w:i w:val="0"/>
+          <w:color w:val="B08A3E"/>
+          <w:sz w:val="21"/>
+        </w:rPr>
+        <w:t>•</w:t>
+        <w:tab/>
+      </w:r>
+      <w:r>
+        <w:rPr>
+          <w:rFonts w:ascii="Calibri" w:hAnsi="Calibri"/>
+          <w:b/>
+          <w:i w:val="0"/>
+          <w:color w:val="1B3A2F"/>
+          <w:sz w:val="21"/>
+        </w:rPr>
+        <w:t xml:space="preserve">Fee validity: </w:t>
+      </w:r>
+      <w:r>
+        <w:rPr>
+          <w:rFonts w:ascii="Calibri" w:hAnsi="Calibri"/>
+          <w:b w:val="0"/>
+          <w:i w:val="0"/>
+          <w:color w:val="5C5C5C"/>
+          <w:sz w:val="21"/>
+        </w:rPr>
+        <w:t>all fees hold for 90 days from signature and are reviewed annually against transaction volume.</w:t>
+      </w:r>
+    </w:p>
+    <w:p>
+      <w:pPr>
+        <w:spacing w:before="0" w:after="0" w:line="240" w:lineRule="auto"/>
+      </w:pPr>
+      <w:r>
+        <w:rPr>
+          <w:rFonts w:ascii="Calibri" w:hAnsi="Calibri"/>
+          <w:b w:val="0"/>
+          <w:i w:val="0"/>
+          <w:sz w:val="16"/>
+        </w:rPr>
+      </w:r>
+    </w:p>
+    <w:p>
+      <w:pPr>
+        <w:keepNext/>
+        <w:spacing w:before="0" w:after="60"/>
       </w:pPr>
       <w:r>
         <w:rPr>
@@ -8886,7 +9054,7 @@
     </w:p>
     <w:tbl>
       <w:tblPr>
-        <w:tblW w:type="auto" w:w="0"/>
+        <w:tblW w:w="9070" w:type="dxa"/>
         <w:jc w:val="center"/>
         <w:tblBorders>
           <w:top w:val="nil"/>
@@ -8896,7 +9064,6 @@
           <w:insideH w:val="nil"/>
           <w:insideV w:val="nil"/>
         </w:tblBorders>
-        <w:tblLayout w:type="fixed"/>
         <w:tblLayout w:type="fixed"/>
         <w:tblLook w:firstColumn="1" w:firstRow="1" w:lastColumn="0" w:lastRow="0" w:noHBand="0" w:noVBand="1" w:val="04A0"/>
       </w:tblPr>
@@ -9653,6 +9820,7 @@
       <w:rFonts w:ascii="Calibri" w:hAnsi="Calibri"/>
       <w:color w:val="5C5C5C"/>
       <w:sz w:val="21"/>
+      <w:lang w:val="en-GB" w:eastAsia="en-GB" w:bidi="ar-SA"/>
     </w:rPr>
   </w:style>
   <w:style w:type="paragraph" w:styleId="Header">

</xml_diff>